<commit_message>
chore: update PA2 and PA3 deliverables
</commit_message>
<xml_diff>
--- a/PA2/source/Group10-PA2-ProjectProposal.docx
+++ b/PA2/source/Group10-PA2-ProjectProposal.docx
@@ -300,7 +300,7 @@
         <w:rPr>
           <w:rFonts w:cs="Arial"/>
         </w:rPr>
-        <w:t>3. Chess Guided Beginner Review Module alternatives  —  7</w:t>
+        <w:t>3. Chess Guided Beginner Review Module alternatives  —  6</w:t>
       </w:r>
     </w:p>
     <w:p>
@@ -314,7 +314,7 @@
         <w:rPr>
           <w:rFonts w:cs="Arial"/>
         </w:rPr>
-        <w:t>3.1 C-A1 Beginner Review Preset  —  7</w:t>
+        <w:t>3.1 C-A1 Beginner Review Preset  —  6</w:t>
       </w:r>
     </w:p>
     <w:p>
@@ -342,7 +342,7 @@
         <w:rPr>
           <w:rFonts w:cs="Arial"/>
         </w:rPr>
-        <w:t>3.3 C-A3 Visual Game Story  —  10</w:t>
+        <w:t>3.3 C-A3 Visual Game Story  —  9</w:t>
       </w:r>
     </w:p>
     <w:p>
@@ -394,7 +394,7 @@
         <w:rPr>
           <w:rFonts w:cs="Arial"/>
         </w:rPr>
-        <w:t>7. Design rationale and validation target  —  13</w:t>
+        <w:t>7. Design rationale and validation target  —  14</w:t>
       </w:r>
     </w:p>
     <w:p>
@@ -407,7 +407,7 @@
         <w:rPr>
           <w:rFonts w:cs="Arial"/>
         </w:rPr>
-        <w:t>8. Guided Concierge Flow - Detailed Revision  —  13</w:t>
+        <w:t>8. Guided Concierge Flow - Detailed Revision  —  14</w:t>
       </w:r>
     </w:p>
     <w:p>
@@ -435,7 +435,7 @@
         <w:rPr>
           <w:rFonts w:cs="Arial"/>
         </w:rPr>
-        <w:t>8.2 Guided Concierge Screens  —  17</w:t>
+        <w:t>8.2 Guided Concierge Screens  —  18</w:t>
       </w:r>
     </w:p>
     <w:p>
@@ -448,7 +448,7 @@
         <w:rPr>
           <w:rFonts w:cs="Arial"/>
         </w:rPr>
-        <w:t>9. Empty, Error, and Validation State Contract  —  21</w:t>
+        <w:t>9. Empty, Error, and Validation State Contract  —  22</w:t>
       </w:r>
     </w:p>
     <w:p>
@@ -462,7 +462,7 @@
         <w:rPr>
           <w:rFonts w:cs="Arial"/>
         </w:rPr>
-        <w:t>9.1 Complete Empty, Error, and Validation Matrix  —  23</w:t>
+        <w:t>9.1 Complete Empty, Error, and Validation Matrix  —  24</w:t>
       </w:r>
     </w:p>
     <w:p>
@@ -475,7 +475,7 @@
         <w:rPr>
           <w:rFonts w:cs="Arial"/>
         </w:rPr>
-        <w:t>10. Mini Design System Appendix  —  26</w:t>
+        <w:t>10. Mini Design System Appendix  —  27</w:t>
       </w:r>
     </w:p>
     <w:p>
@@ -488,7 +488,7 @@
         <w:rPr>
           <w:rFonts w:cs="Arial"/>
         </w:rPr>
-        <w:t>11. Practical Difficulties and Lessons Learned  —  27</w:t>
+        <w:t>11. Practical Difficulties and Lessons Learned  —  28</w:t>
       </w:r>
     </w:p>
     <w:p>
@@ -5857,6 +5857,17 @@
     </w:tbl>
     <w:p>
       <w:pPr>
+        <w:sectPr>
+          <w:type w:val="nextPage"/>
+          <w:pgSz w:w="11906" w:h="16838"/>
+          <w:pgMar w:top="1134" w:right="1134" w:bottom="1020" w:left="1134" w:header="454" w:footer="454" w:gutter="0"/>
+          <w:cols w:space="720"/>
+          <w:docGrid w:linePitch="360"/>
+        </w:sectPr>
+      </w:pPr>
+    </w:p>
+    <w:p>
+      <w:pPr>
         <w:pStyle w:val="Heading1"/>
       </w:pPr>
       <w:r>
@@ -6246,6 +6257,17 @@
       <w:r>
         <w:t>ons produce observed evidence.</w:t>
       </w:r>
+    </w:p>
+    <w:p>
+      <w:pPr>
+        <w:sectPr>
+          <w:type w:val="nextPage"/>
+          <w:pgSz w:w="16838" w:h="11906" w:orient="landscape"/>
+          <w:pgMar w:top="737" w:right="737" w:bottom="737" w:left="737" w:header="454" w:footer="454" w:gutter="0"/>
+          <w:cols w:space="720"/>
+          <w:docGrid w:linePitch="360"/>
+        </w:sectPr>
+      </w:pPr>
     </w:p>
     <w:p>
       <w:pPr>

</xml_diff>